<commit_message>
Títulos numerados con guion, HU-31 hecha e historias v3 sin pendientes de código
</commit_message>
<xml_diff>
--- a/docs/entregables/Historias_de_Usuario_NuevaMente_v3.docx
+++ b/docs/entregables/Historias_de_Usuario_NuevaMente_v3.docx
@@ -123,7 +123,7 @@
     </w:p>
     <w:p>
       <w:r>
-        <w:t>Contiene 101 historias organizadas en 15 épicas: 99 están hechas, 2 están en parte y 0 están pendientes. El estado corresponde al código de la rama SPRINT05 al 27 de octubre de 2026.</w:t>
+        <w:t>Contiene 101 historias organizadas en 15 épicas: 100 están hechas, 1 está en parte y 0 están pendientes. El estado corresponde al código de la rama SPRINT05 al 27 de octubre de 2026.</w:t>
       </w:r>
     </w:p>
     <w:p>
@@ -163,7 +163,7 @@
         <w:pStyle w:val="ListBullet"/>
       </w:pPr>
       <w:r>
-        <w:t>Siguen en parte: la capa Always Free (falta confirmar el presupuesto de 1 USD) y la estabilidad de la cuota gratuita de Gemini. Las historias de Bryan Infante pasan a Ethan Espinoza Acosta y las de Adrian Gil a Gaspar Martinez Paiva.</w:t>
+        <w:t>HU-31 pasa a Hecho con la cadena de proveedores gratuitos, y HU-05 reconoce títulos numerados con guion («1 - Objetivos»). El código queda sin historias pendientes; solo HU-83 sigue en parte porque el presupuesto de 1 USD se confirma en la consola de OCI. Las historias de Bryan Infante pasan a Ethan Espinoza Acosta y las de Adrian Gil a Gaspar Martinez Paiva.</w:t>
       </w:r>
     </w:p>
     <w:p>
@@ -1063,7 +1063,7 @@
                 <w:b w:val="0"/>
                 <w:sz w:val="20"/>
               </w:rPr>
-              <w:t>9</w:t>
+              <w:t>10</w:t>
             </w:r>
           </w:p>
         </w:tc>
@@ -1081,7 +1081,7 @@
                 <w:b w:val="0"/>
                 <w:sz w:val="20"/>
               </w:rPr>
-              <w:t>1</w:t>
+              <w:t>0</w:t>
             </w:r>
           </w:p>
         </w:tc>
@@ -2270,7 +2270,7 @@
                 <w:b/>
                 <w:sz w:val="20"/>
               </w:rPr>
-              <w:t>99</w:t>
+              <w:t>100</w:t>
             </w:r>
           </w:p>
         </w:tc>
@@ -2289,7 +2289,7 @@
                 <w:b/>
                 <w:sz w:val="20"/>
               </w:rPr>
-              <w:t>2</w:t>
+              <w:t>1</w:t>
             </w:r>
           </w:p>
         </w:tc>
@@ -5114,19 +5114,19 @@
         <w:tc>
           <w:tcPr>
             <w:tcW w:type="dxa" w:w="1247"/>
-            <w:shd w:val="clear" w:color="auto" w:fill="FFF4D4"/>
-          </w:tcPr>
-          <w:p>
-            <w:pPr>
-              <w:spacing w:after="0"/>
-            </w:pPr>
-            <w:r/>
-            <w:r>
-              <w:rPr>
-                <w:b w:val="0"/>
-                <w:sz w:val="20"/>
-              </w:rPr>
-              <w:t>Parcial</w:t>
+            <w:shd w:val="clear" w:color="auto" w:fill="DCF7EE"/>
+          </w:tcPr>
+          <w:p>
+            <w:pPr>
+              <w:spacing w:after="0"/>
+            </w:pPr>
+            <w:r/>
+            <w:r>
+              <w:rPr>
+                <w:b w:val="0"/>
+                <w:sz w:val="20"/>
+              </w:rPr>
+              <w:t>Hecho</w:t>
             </w:r>
           </w:p>
         </w:tc>
@@ -11981,7 +11981,7 @@
                 <w:b w:val="0"/>
                 <w:sz w:val="20"/>
               </w:rPr>
-              <w:t>•  En PDF y texto plano se reconocen títulos numerados («1. Acceso…») y líneas en mayúsculas, incluso si el título ocupa dos líneas; las oraciones partidas y los puntos de lista no se toman por títulos.</w:t>
+              <w:t>•  En PDF y texto plano se reconocen títulos numerados («1. Acceso…», «1 - Objetivos», «2 – Alcance») y líneas en mayúsculas, incluso si el título ocupa dos líneas; las oraciones partidas, los rangos («10 - 20 personas») y los puntos de lista no se toman por títulos.</w:t>
             </w:r>
           </w:p>
           <w:p>
@@ -20014,7 +20014,7 @@
                 <w:b w:val="0"/>
                 <w:sz w:val="20"/>
               </w:rPr>
-              <w:t>•  Pendiente: en el plan gratuito, cuando se agotan las cuotas del día o hay picos de demanda (503), se usa el respaldo local.</w:t>
+              <w:t>•  Si Gemini se queda sin cuota o está saturado (503), la cadena sigue con Groq, Cerebras y OpenRouter (gratuitos) antes de usar el respaldo local; el enrutado por salud aparta al proveedor caído.</w:t>
             </w:r>
           </w:p>
         </w:tc>
@@ -20087,19 +20087,19 @@
         <w:tc>
           <w:tcPr>
             <w:tcW w:type="dxa" w:w="7143"/>
-            <w:shd w:val="clear" w:color="auto" w:fill="FFF4D4"/>
-          </w:tcPr>
-          <w:p>
-            <w:pPr>
-              <w:spacing w:after="0"/>
-            </w:pPr>
-            <w:r/>
-            <w:r>
-              <w:rPr>
-                <w:b/>
-                <w:sz w:val="20"/>
-              </w:rPr>
-              <w:t>Parcial</w:t>
+            <w:shd w:val="clear" w:color="auto" w:fill="DCF7EE"/>
+          </w:tcPr>
+          <w:p>
+            <w:pPr>
+              <w:spacing w:after="0"/>
+            </w:pPr>
+            <w:r/>
+            <w:r>
+              <w:rPr>
+                <w:b/>
+                <w:sz w:val="20"/>
+              </w:rPr>
+              <w:t>Hecho</w:t>
             </w:r>
           </w:p>
         </w:tc>
@@ -39029,7 +39029,7 @@
     </w:p>
     <w:p>
       <w:r>
-        <w:t>Estas 2 historias no están terminadas. Están ordenadas por prioridad: primero las imprescindibles para el MVP.</w:t>
+        <w:t>Esta historia no está terminada: no depende del código, sino de una confirmación en la cuenta de OCI.</w:t>
       </w:r>
     </w:p>
     <w:tbl>
@@ -39275,102 +39275,6 @@
                 <w:sz w:val="19"/>
               </w:rPr>
               <w:t>Confirmar en la cuenta (ya creada) el presupuesto y que no se actualizó a Pay As You Go.</w:t>
-            </w:r>
-          </w:p>
-        </w:tc>
-      </w:tr>
-      <w:tr>
-        <w:trPr>
-          <w:cantSplit/>
-        </w:trPr>
-        <w:tc>
-          <w:tcPr>
-            <w:tcW w:type="dxa" w:w="907"/>
-          </w:tcPr>
-          <w:p>
-            <w:pPr>
-              <w:spacing w:after="0"/>
-            </w:pPr>
-            <w:r/>
-            <w:r>
-              <w:rPr>
-                <w:b w:val="0"/>
-                <w:sz w:val="19"/>
-              </w:rPr>
-              <w:t>HU-31</w:t>
-            </w:r>
-          </w:p>
-        </w:tc>
-        <w:tc>
-          <w:tcPr>
-            <w:tcW w:type="dxa" w:w="2608"/>
-          </w:tcPr>
-          <w:p>
-            <w:pPr>
-              <w:spacing w:after="0"/>
-            </w:pPr>
-            <w:r/>
-            <w:r>
-              <w:rPr>
-                <w:b w:val="0"/>
-                <w:sz w:val="19"/>
-              </w:rPr>
-              <w:t>Modelo principal de Gemini estable</w:t>
-            </w:r>
-          </w:p>
-        </w:tc>
-        <w:tc>
-          <w:tcPr>
-            <w:tcW w:type="dxa" w:w="1077"/>
-          </w:tcPr>
-          <w:p>
-            <w:pPr>
-              <w:spacing w:after="0"/>
-            </w:pPr>
-            <w:r/>
-            <w:r>
-              <w:rPr>
-                <w:b w:val="0"/>
-                <w:sz w:val="19"/>
-              </w:rPr>
-              <w:t>Debería</w:t>
-            </w:r>
-          </w:p>
-        </w:tc>
-        <w:tc>
-          <w:tcPr>
-            <w:tcW w:type="dxa" w:w="1020"/>
-            <w:shd w:val="clear" w:color="auto" w:fill="FFF4D4"/>
-          </w:tcPr>
-          <w:p>
-            <w:pPr>
-              <w:spacing w:after="0"/>
-            </w:pPr>
-            <w:r/>
-            <w:r>
-              <w:rPr>
-                <w:b w:val="0"/>
-                <w:sz w:val="19"/>
-              </w:rPr>
-              <w:t>Parcial</w:t>
-            </w:r>
-          </w:p>
-        </w:tc>
-        <w:tc>
-          <w:tcPr>
-            <w:tcW w:type="dxa" w:w="3798"/>
-          </w:tcPr>
-          <w:p>
-            <w:pPr>
-              <w:spacing w:after="0"/>
-            </w:pPr>
-            <w:r/>
-            <w:r>
-              <w:rPr>
-                <w:b w:val="0"/>
-                <w:sz w:val="19"/>
-              </w:rPr>
-              <w:t>En el plan gratuito, cuando se agotan las cuotas del día o hay picos de demanda (503), se usa el respaldo local.</w:t>
             </w:r>
           </w:p>
         </w:tc>

</xml_diff>

<commit_message>
Informe del Sprint 5 e historias v3: pendientes resueltos
</commit_message>
<xml_diff>
--- a/docs/entregables/Historias_de_Usuario_NuevaMente_v3.docx
+++ b/docs/entregables/Historias_de_Usuario_NuevaMente_v3.docx
@@ -123,7 +123,7 @@
     </w:p>
     <w:p>
       <w:r>
-        <w:t>Contiene 101 historias organizadas en 15 épicas: 100 están hechas, 1 está en parte y 0 están pendientes. El estado corresponde al código de la rama SPRINT05 al 27 de octubre de 2026.</w:t>
+        <w:t>Contiene 101 historias organizadas en 15 épicas: las 101 están hechas, 0 están en parte y 0 están pendientes. El estado corresponde al código de la rama SPRINT05 al 27 de octubre de 2026.</w:t>
       </w:r>
     </w:p>
     <w:p>
@@ -163,7 +163,7 @@
         <w:pStyle w:val="ListBullet"/>
       </w:pPr>
       <w:r>
-        <w:t>HU-31 pasa a Hecho con la cadena de proveedores gratuitos, y HU-05 reconoce títulos numerados con guion («1 - Objetivos»). El código queda sin historias pendientes; solo HU-83 sigue en parte porque el presupuesto de 1 USD se confirma en la consola de OCI. Las historias de Bryan Infante pasan a Ethan Espinoza Acosta y las de Adrian Gil a Gaspar Martinez Paiva.</w:t>
+        <w:t>HU-31 pasa a Hecho con la cadena de proveedores gratuitos, HU-05 reconoce títulos numerados con guion («1 - Objetivos») y HU-83 se confirmó en la consola de OCI. No quedan historias pendientes. Las historias de Bryan Infante pasan a Ethan Espinoza Acosta y las de Adrian Gil a Gaspar Martinez Paiva.</w:t>
       </w:r>
     </w:p>
     <w:p>
@@ -1943,7 +1943,7 @@
                 <w:b w:val="0"/>
                 <w:sz w:val="20"/>
               </w:rPr>
-              <w:t>5</w:t>
+              <w:t>6</w:t>
             </w:r>
           </w:p>
         </w:tc>
@@ -1961,7 +1961,7 @@
                 <w:b w:val="0"/>
                 <w:sz w:val="20"/>
               </w:rPr>
-              <w:t>1</w:t>
+              <w:t>0</w:t>
             </w:r>
           </w:p>
         </w:tc>
@@ -2270,7 +2270,7 @@
                 <w:b/>
                 <w:sz w:val="20"/>
               </w:rPr>
-              <w:t>100</w:t>
+              <w:t>101</w:t>
             </w:r>
           </w:p>
         </w:tc>
@@ -2289,7 +2289,7 @@
                 <w:b/>
                 <w:sz w:val="20"/>
               </w:rPr>
-              <w:t>1</w:t>
+              <w:t>0</w:t>
             </w:r>
           </w:p>
         </w:tc>
@@ -9814,19 +9814,19 @@
         <w:tc>
           <w:tcPr>
             <w:tcW w:type="dxa" w:w="1247"/>
-            <w:shd w:val="clear" w:color="auto" w:fill="FFF4D4"/>
-          </w:tcPr>
-          <w:p>
-            <w:pPr>
-              <w:spacing w:after="0"/>
-            </w:pPr>
-            <w:r/>
-            <w:r>
-              <w:rPr>
-                <w:b w:val="0"/>
-                <w:sz w:val="20"/>
-              </w:rPr>
-              <w:t>Parcial</w:t>
+            <w:shd w:val="clear" w:color="auto" w:fill="DCF7EE"/>
+          </w:tcPr>
+          <w:p>
+            <w:pPr>
+              <w:spacing w:after="0"/>
+            </w:pPr>
+            <w:r/>
+            <w:r>
+              <w:rPr>
+                <w:b w:val="0"/>
+                <w:sz w:val="20"/>
+              </w:rPr>
+              <w:t>Hecho</w:t>
             </w:r>
           </w:p>
         </w:tc>
@@ -36138,7 +36138,7 @@
                 <w:b w:val="0"/>
                 <w:sz w:val="20"/>
               </w:rPr>
-              <w:t>•  Pendiente: confirmar en la cuenta (ya creada) el presupuesto y que no se actualizó a Pay As You Go.</w:t>
+              <w:t>•  Confirmado en la consola de OCI: presupuesto de 1 USD con alerta y cuenta sin pasar a Pay As You Go.</w:t>
             </w:r>
           </w:p>
         </w:tc>
@@ -36211,19 +36211,19 @@
         <w:tc>
           <w:tcPr>
             <w:tcW w:type="dxa" w:w="7143"/>
-            <w:shd w:val="clear" w:color="auto" w:fill="FFF4D4"/>
-          </w:tcPr>
-          <w:p>
-            <w:pPr>
-              <w:spacing w:after="0"/>
-            </w:pPr>
-            <w:r/>
-            <w:r>
-              <w:rPr>
-                <w:b/>
-                <w:sz w:val="20"/>
-              </w:rPr>
-              <w:t>Parcial</w:t>
+            <w:shd w:val="clear" w:color="auto" w:fill="DCF7EE"/>
+          </w:tcPr>
+          <w:p>
+            <w:pPr>
+              <w:spacing w:after="0"/>
+            </w:pPr>
+            <w:r/>
+            <w:r>
+              <w:rPr>
+                <w:b/>
+                <w:sz w:val="20"/>
+              </w:rPr>
+              <w:t>Hecho</w:t>
             </w:r>
           </w:p>
         </w:tc>
@@ -39029,257 +39029,9 @@
     </w:p>
     <w:p>
       <w:r>
-        <w:t>Esta historia no está terminada: no depende del código, sino de una confirmación en la cuenta de OCI.</w:t>
+        <w:t>No quedan historias pendientes: las 101 historias están hechas.</w:t>
       </w:r>
     </w:p>
-    <w:tbl>
-      <w:tblPr>
-        <w:tblW w:type="auto" w:w="0"/>
-        <w:tblLayout w:type="fixed"/>
-        <w:tblLook w:firstColumn="1" w:firstRow="1" w:lastColumn="0" w:lastRow="0" w:noHBand="0" w:noVBand="1" w:val="04A0"/>
-        <w:tblBorders>
-          <w:top w:val="single" w:sz="4" w:color="D9D3EC"/>
-          <w:left w:val="single" w:sz="4" w:color="D9D3EC"/>
-          <w:bottom w:val="single" w:sz="4" w:color="D9D3EC"/>
-          <w:right w:val="single" w:sz="4" w:color="D9D3EC"/>
-          <w:insideH w:val="single" w:sz="4" w:color="D9D3EC"/>
-          <w:insideV w:val="single" w:sz="4" w:color="D9D3EC"/>
-        </w:tblBorders>
-      </w:tblPr>
-      <w:tblGrid>
-        <w:gridCol w:w="1882"/>
-        <w:gridCol w:w="1882"/>
-        <w:gridCol w:w="1882"/>
-        <w:gridCol w:w="1882"/>
-        <w:gridCol w:w="1882"/>
-      </w:tblGrid>
-      <w:tr>
-        <w:trPr>
-          <w:tblHeader w:val="true"/>
-        </w:trPr>
-        <w:tc>
-          <w:tcPr>
-            <w:tcW w:type="dxa" w:w="907"/>
-            <w:shd w:val="clear" w:color="auto" w:fill="4B2FC2"/>
-          </w:tcPr>
-          <w:p>
-            <w:pPr>
-              <w:spacing w:after="0"/>
-            </w:pPr>
-            <w:r>
-              <w:rPr>
-                <w:b/>
-                <w:color w:val="FFFFFF"/>
-              </w:rPr>
-            </w:r>
-            <w:r>
-              <w:rPr>
-                <w:b/>
-                <w:color w:val="FFFFFF"/>
-                <w:sz w:val="20"/>
-              </w:rPr>
-              <w:t>ID</w:t>
-            </w:r>
-          </w:p>
-        </w:tc>
-        <w:tc>
-          <w:tcPr>
-            <w:tcW w:type="dxa" w:w="2608"/>
-            <w:shd w:val="clear" w:color="auto" w:fill="4B2FC2"/>
-          </w:tcPr>
-          <w:p>
-            <w:pPr>
-              <w:spacing w:after="0"/>
-            </w:pPr>
-            <w:r>
-              <w:rPr>
-                <w:b/>
-                <w:color w:val="FFFFFF"/>
-              </w:rPr>
-            </w:r>
-            <w:r>
-              <w:rPr>
-                <w:b/>
-                <w:color w:val="FFFFFF"/>
-                <w:sz w:val="20"/>
-              </w:rPr>
-              <w:t>Historia</w:t>
-            </w:r>
-          </w:p>
-        </w:tc>
-        <w:tc>
-          <w:tcPr>
-            <w:tcW w:type="dxa" w:w="1077"/>
-            <w:shd w:val="clear" w:color="auto" w:fill="4B2FC2"/>
-          </w:tcPr>
-          <w:p>
-            <w:pPr>
-              <w:spacing w:after="0"/>
-            </w:pPr>
-            <w:r>
-              <w:rPr>
-                <w:b/>
-                <w:color w:val="FFFFFF"/>
-              </w:rPr>
-            </w:r>
-            <w:r>
-              <w:rPr>
-                <w:b/>
-                <w:color w:val="FFFFFF"/>
-                <w:sz w:val="20"/>
-              </w:rPr>
-              <w:t>Prioridad</w:t>
-            </w:r>
-          </w:p>
-        </w:tc>
-        <w:tc>
-          <w:tcPr>
-            <w:tcW w:type="dxa" w:w="1020"/>
-            <w:shd w:val="clear" w:color="auto" w:fill="4B2FC2"/>
-          </w:tcPr>
-          <w:p>
-            <w:pPr>
-              <w:spacing w:after="0"/>
-            </w:pPr>
-            <w:r>
-              <w:rPr>
-                <w:b/>
-                <w:color w:val="FFFFFF"/>
-              </w:rPr>
-            </w:r>
-            <w:r>
-              <w:rPr>
-                <w:b/>
-                <w:color w:val="FFFFFF"/>
-                <w:sz w:val="20"/>
-              </w:rPr>
-              <w:t>Estado</w:t>
-            </w:r>
-          </w:p>
-        </w:tc>
-        <w:tc>
-          <w:tcPr>
-            <w:tcW w:type="dxa" w:w="3798"/>
-            <w:shd w:val="clear" w:color="auto" w:fill="4B2FC2"/>
-          </w:tcPr>
-          <w:p>
-            <w:pPr>
-              <w:spacing w:after="0"/>
-            </w:pPr>
-            <w:r>
-              <w:rPr>
-                <w:b/>
-                <w:color w:val="FFFFFF"/>
-              </w:rPr>
-            </w:r>
-            <w:r>
-              <w:rPr>
-                <w:b/>
-                <w:color w:val="FFFFFF"/>
-                <w:sz w:val="20"/>
-              </w:rPr>
-              <w:t>Qué falta</w:t>
-            </w:r>
-          </w:p>
-        </w:tc>
-      </w:tr>
-      <w:tr>
-        <w:trPr>
-          <w:cantSplit/>
-        </w:trPr>
-        <w:tc>
-          <w:tcPr>
-            <w:tcW w:type="dxa" w:w="907"/>
-          </w:tcPr>
-          <w:p>
-            <w:pPr>
-              <w:spacing w:after="0"/>
-            </w:pPr>
-            <w:r/>
-            <w:r>
-              <w:rPr>
-                <w:b w:val="0"/>
-                <w:sz w:val="19"/>
-              </w:rPr>
-              <w:t>HU-83</w:t>
-            </w:r>
-          </w:p>
-        </w:tc>
-        <w:tc>
-          <w:tcPr>
-            <w:tcW w:type="dxa" w:w="2608"/>
-          </w:tcPr>
-          <w:p>
-            <w:pPr>
-              <w:spacing w:after="0"/>
-            </w:pPr>
-            <w:r/>
-            <w:r>
-              <w:rPr>
-                <w:b w:val="0"/>
-                <w:sz w:val="19"/>
-              </w:rPr>
-              <w:t>Mantenerse en la capa Always Free</w:t>
-            </w:r>
-          </w:p>
-        </w:tc>
-        <w:tc>
-          <w:tcPr>
-            <w:tcW w:type="dxa" w:w="1077"/>
-          </w:tcPr>
-          <w:p>
-            <w:pPr>
-              <w:spacing w:after="0"/>
-            </w:pPr>
-            <w:r/>
-            <w:r>
-              <w:rPr>
-                <w:b w:val="0"/>
-                <w:sz w:val="19"/>
-              </w:rPr>
-              <w:t>Debe</w:t>
-            </w:r>
-          </w:p>
-        </w:tc>
-        <w:tc>
-          <w:tcPr>
-            <w:tcW w:type="dxa" w:w="1020"/>
-            <w:shd w:val="clear" w:color="auto" w:fill="FFF4D4"/>
-          </w:tcPr>
-          <w:p>
-            <w:pPr>
-              <w:spacing w:after="0"/>
-            </w:pPr>
-            <w:r/>
-            <w:r>
-              <w:rPr>
-                <w:b w:val="0"/>
-                <w:sz w:val="19"/>
-              </w:rPr>
-              <w:t>Parcial</w:t>
-            </w:r>
-          </w:p>
-        </w:tc>
-        <w:tc>
-          <w:tcPr>
-            <w:tcW w:type="dxa" w:w="3798"/>
-          </w:tcPr>
-          <w:p>
-            <w:pPr>
-              <w:spacing w:after="0"/>
-            </w:pPr>
-            <w:r/>
-            <w:r>
-              <w:rPr>
-                <w:b w:val="0"/>
-                <w:sz w:val="19"/>
-              </w:rPr>
-              <w:t>Confirmar en la cuenta (ya creada) el presupuesto y que no se actualizó a Pay As You Go.</w:t>
-            </w:r>
-          </w:p>
-        </w:tc>
-      </w:tr>
-    </w:tbl>
     <w:sectPr>
       <w:headerReference w:type="default" r:id="rId9"/>
       <w:footerReference w:type="default" r:id="rId10"/>

</xml_diff>